<commit_message>
single-output 3D model matching the published 2D architecture, plus test suite
</commit_message>
<xml_diff>
--- a/docs/GUIDE_3D_model.docx
+++ b/docs/GUIDE_3D_model.docx
@@ -16,7 +16,7 @@
         <w:pStyle w:val="FirstParagraph"/>
       </w:pPr>
       <w:r>
-        <w:t xml:space="preserve">Eleven files. Two define networks, six do something with them, and three are tests.</w:t>
+        <w:t xml:space="preserve">Six files. One defines the network; the other five do something with it.</w:t>
       </w:r>
       <w:r>
         <w:t xml:space="preserve"> </w:t>
@@ -166,7 +166,7 @@
               <w:jc w:val="left"/>
             </w:pPr>
             <w:r>
-              <w:t xml:space="preserve">337</w:t>
+              <w:t xml:space="preserve">308</w:t>
             </w:r>
           </w:p>
         </w:tc>
@@ -335,196 +335,6 @@
           </w:p>
         </w:tc>
       </w:tr>
-      <w:tr>
-        <w:tc>
-          <w:tcPr/>
-          <w:p>
-            <w:pPr>
-              <w:pStyle w:val="Compact"/>
-              <w:jc w:val="left"/>
-            </w:pPr>
-            <w:r>
-              <w:t xml:space="preserve">velocity_model.py</w:t>
-            </w:r>
-          </w:p>
-        </w:tc>
-        <w:tc>
-          <w:tcPr/>
-          <w:p>
-            <w:pPr>
-              <w:pStyle w:val="Compact"/>
-              <w:jc w:val="left"/>
-            </w:pPr>
-            <w:r>
-              <w:t xml:space="preserve">589</w:t>
-            </w:r>
-          </w:p>
-        </w:tc>
-        <w:tc>
-          <w:tcPr/>
-          <w:p>
-            <w:pPr>
-              <w:pStyle w:val="Compact"/>
-              <w:jc w:val="left"/>
-            </w:pPr>
-            <w:r>
-              <w:t xml:space="preserve">The velocity operator and the pressure U-Net. The 2D classes are exact ports: the released checkpoints load into them with no missing key. The 3D forms are ours.</w:t>
-            </w:r>
-          </w:p>
-        </w:tc>
-      </w:tr>
-      <w:tr>
-        <w:tc>
-          <w:tcPr/>
-          <w:p>
-            <w:pPr>
-              <w:pStyle w:val="Compact"/>
-              <w:jc w:val="left"/>
-            </w:pPr>
-            <w:r>
-              <w:t xml:space="preserve">train_velocity.py</w:t>
-            </w:r>
-          </w:p>
-        </w:tc>
-        <w:tc>
-          <w:tcPr/>
-          <w:p>
-            <w:pPr>
-              <w:pStyle w:val="Compact"/>
-              <w:jc w:val="left"/>
-            </w:pPr>
-            <w:r>
-              <w:t xml:space="preserve">474</w:t>
-            </w:r>
-          </w:p>
-        </w:tc>
-        <w:tc>
-          <w:tcPr/>
-          <w:p>
-            <w:pPr>
-              <w:pStyle w:val="Compact"/>
-              <w:jc w:val="left"/>
-            </w:pPr>
-            <w:r>
-              <w:t xml:space="preserve">Trains the velocity operator on a dataset this project built. Huber over the pore space plus a weighted divergence penalty.</w:t>
-            </w:r>
-          </w:p>
-        </w:tc>
-      </w:tr>
-      <w:tr>
-        <w:tc>
-          <w:tcPr/>
-          <w:p>
-            <w:pPr>
-              <w:pStyle w:val="Compact"/>
-              <w:jc w:val="left"/>
-            </w:pPr>
-            <w:r>
-              <w:t xml:space="preserve">predict_velocity.py</w:t>
-            </w:r>
-          </w:p>
-        </w:tc>
-        <w:tc>
-          <w:tcPr/>
-          <w:p>
-            <w:pPr>
-              <w:pStyle w:val="Compact"/>
-              <w:jc w:val="left"/>
-            </w:pPr>
-            <w:r>
-              <w:t xml:space="preserve">351</w:t>
-            </w:r>
-          </w:p>
-        </w:tc>
-        <w:tc>
-          <w:tcPr/>
-          <w:p>
-            <w:pPr>
-              <w:pStyle w:val="Compact"/>
-              <w:jc w:val="left"/>
-            </w:pPr>
-            <w:r>
-              <w:t xml:space="preserve">Runs it on a geometry, or over a whole dataset with --write-back, which stores the field as samples/velocity_pred beside the simulated one.</w:t>
-            </w:r>
-          </w:p>
-        </w:tc>
-      </w:tr>
-      <w:tr>
-        <w:tc>
-          <w:tcPr/>
-          <w:p>
-            <w:pPr>
-              <w:pStyle w:val="Compact"/>
-              <w:jc w:val="left"/>
-            </w:pPr>
-            <w:r>
-              <w:t xml:space="preserve">test_flow_pipeline.py</w:t>
-            </w:r>
-          </w:p>
-        </w:tc>
-        <w:tc>
-          <w:tcPr/>
-          <w:p>
-            <w:pPr>
-              <w:pStyle w:val="Compact"/>
-              <w:jc w:val="left"/>
-            </w:pPr>
-            <w:r>
-              <w:t xml:space="preserve">339</w:t>
-            </w:r>
-          </w:p>
-        </w:tc>
-        <w:tc>
-          <w:tcPr/>
-          <w:p>
-            <w:pPr>
-              <w:pStyle w:val="Compact"/>
-              <w:jc w:val="left"/>
-            </w:pPr>
-            <w:r>
-              <w:t xml:space="preserve">The velocity pipeline end to end: the descriptors, the port, the wiring on a dataset it builds itself, the guards.</w:t>
-            </w:r>
-          </w:p>
-        </w:tc>
-      </w:tr>
-      <w:tr>
-        <w:tc>
-          <w:tcPr/>
-          <w:p>
-            <w:pPr>
-              <w:pStyle w:val="Compact"/>
-              <w:jc w:val="left"/>
-            </w:pPr>
-            <w:r>
-              <w:t xml:space="preserve">test_reference_parity.py</w:t>
-            </w:r>
-          </w:p>
-        </w:tc>
-        <w:tc>
-          <w:tcPr/>
-          <w:p>
-            <w:pPr>
-              <w:pStyle w:val="Compact"/>
-              <w:jc w:val="left"/>
-            </w:pPr>
-            <w:r>
-              <w:t xml:space="preserve">194</w:t>
-            </w:r>
-          </w:p>
-        </w:tc>
-        <w:tc>
-          <w:tcPr/>
-          <w:p>
-            <w:pPr>
-              <w:pStyle w:val="Compact"/>
-              <w:jc w:val="left"/>
-            </w:pPr>
-            <w:r>
-              <w:t xml:space="preserve">Our descriptors against theirs, on their own bundled domain, voxel by voxel. The check that makes a comparison with their published numbers mean something.</w:t>
-            </w:r>
-          </w:p>
-        </w:tc>
-      </w:tr>
     </w:tbl>
     <w:bookmarkEnd w:id="20"/>
     <w:bookmarkStart w:id="21" w:name="how-the-pieces-connect"/>
@@ -972,29 +782,7 @@
         <w:pStyle w:val="BodyText"/>
       </w:pPr>
       <w:r>
-        <w:rPr>
-          <w:bCs/>
-          <w:b/>
-        </w:rPr>
-        <w:t>--velocity-informed is a flag on this script like the feature switches, but it is not one of them and the window does not put it on the Train page. It reaches it through a panel of its own, The flow field then The flow pipeline, because unlike A, B and C it needs three earlier stages to have run against the same dataset first. This script also refuses --velocity-informed together with --flow-proxy or --dim-free: switch A replaces the trunk's geometry feature, the flow pipeline leaves the trunk alone and adds to the branch, and whichever won would be a coin toss the log did not record.</w:t>
-      </w:r>
-      <w:r/>
-      <w:r/>
-      <w:r/>
-      <w:r/>
-      <w:r/>
-      <w:r/>
-      <w:r/>
-      <w:r/>
-      <w:r/>
-      <w:r/>
-    </w:p>
-    <w:p>
-      <w:pPr>
-        <w:pStyle w:val="BodyText"/>
-      </w:pPr>
-      <w:r>
-        <w:t>(372 lines.)</w:t>
+        <w:t xml:space="preserve">(308 lines.)</w:t>
       </w:r>
     </w:p>
     <w:bookmarkEnd w:id="23"/>
@@ -1906,244 +1694,6 @@
       </w:r>
       <w:r>
         <w:t xml:space="preserve">worth it.</w:t>
-      </w:r>
-    </w:p>
-    <w:p>
-      <w:pPr>
-        <w:pStyle w:val="BodyText"/>
-      </w:pPr>
-      <w:r>
-        <w:t xml:space="preserve">The velocity operator</w:t>
-      </w:r>
-    </w:p>
-    <w:p>
-      <w:pPr>
-        <w:pStyle w:val="BodyText"/>
-      </w:pPr>
-      <w:r>
-        <w:t xml:space="preserve">velocity_model.py, train_velocity.py, predict_velocity.py</w:t>
-      </w:r>
-    </w:p>
-    <w:p>
-      <w:pPr>
-        <w:pStyle w:val="BodyText"/>
-      </w:pPr>
-      <w:r>
-        <w:rPr>
-          <w:iCs/>
-          <w:i/>
-        </w:rPr>
-        <w:t xml:space="preserve">A second operator, from the pore structure to the flow field.</w:t>
-      </w:r>
-    </w:p>
-    <w:p>
-      <w:pPr>
-        <w:pStyle w:val="BodyText"/>
-      </w:pPr>
-      <w:r>
-        <w:t>the flow pipeline can be run on the velocity the solver already produced, and that is the experiment to do first, because it measures the ceiling a predicted field is chasing and costs nothing to set up. The published pipeline instead predicts the field, and that needs these three.</w:t>
-      </w:r>
-    </w:p>
-    <w:p>
-      <w:pPr>
-        <w:pStyle w:val="BodyText"/>
-      </w:pPr>
-      <w:r>
-        <w:t xml:space="preserve">The architecture is the same branch and trunk with different inputs. The branch sees the pore mask with the MIS and UPRM maps stacked on it; the parameter branch sees one flow number; the trunk sees each voxel’s position, the squared wall distance and the two or three components of the harmonic pressure gradient. The output is a vector and a DeepONet produces a scalar, so the latent is cut into one block per component and summed within each block. A 128 wide latent gives 64 per component in two dimensions; three components do not divide 128, so the 3D default is 192, which keeps 64 per component rather than silently narrowing each one.</w:t>
-      </w:r>
-    </w:p>
-    <w:p>
-      <w:pPr>
-        <w:pStyle w:val="BodyText"/>
-      </w:pPr>
-      <w:r>
-        <w:t xml:space="preserve">The loss is a Huber term averaged over the PORE VOXELS ONLY, plus lambda times the mean squared divergence over the interior. Averaging over the whole grid instead would make a low porosity rock look easy, because most of its voxels are solid and predicted zero by construction.</w:t>
-      </w:r>
-    </w:p>
-    <w:p>
-      <w:pPr>
-        <w:pStyle w:val="BodyText"/>
-      </w:pPr>
-      <w:r>
-        <w:rPr>
-          <w:bCs/>
-          <w:b/>
-        </w:rPr>
-        <w:t xml:space="preserve">Run them like this.</w:t>
-      </w:r>
-    </w:p>
-    <w:p>
-      <w:pPr>
-        <w:pStyle w:val="BodyText"/>
-      </w:pPr>
-      <w:r>
-        <w:t xml:space="preserve">python train_velocity.py --data dataset.h5 --out runs/vel</w:t>
-      </w:r>
-    </w:p>
-    <w:p>
-      <w:pPr>
-        <w:pStyle w:val="BodyText"/>
-      </w:pPr>
-      <w:r>
-        <w:t xml:space="preserve">python predict_velocity.py --checkpoint runs/vel/best.pt --data dataset.h5 --write-back</w:t>
-      </w:r>
-    </w:p>
-    <w:p>
-      <w:pPr>
-        <w:pStyle w:val="BodyText"/>
-      </w:pPr>
-      <w:r>
-        <w:rPr>
-          <w:bCs/>
-          <w:b/>
-        </w:rPr>
-        <w:t xml:space="preserve">What you get back.</w:t>
-      </w:r>
-      <w:r>
-        <w:t xml:space="preserve"> </w:t>
-      </w:r>
-      <w:r>
-        <w:t xml:space="preserve">runs/vel/best.pt, carrying the weights AND the grid, the feature scaling, the velocity standardisation, the held out geometries and the name of the conditioning column. Then samples/velocity_pred inside the dataset, written beside samples/velocity and never over it.</w:t>
-      </w:r>
-    </w:p>
-    <w:p>
-      <w:pPr>
-        <w:pStyle w:val="BodyText"/>
-      </w:pPr>
-      <w:r>
-        <w:rPr>
-          <w:bCs/>
-          <w:b/>
-        </w:rPr>
-        <w:t xml:space="preserve">Worth knowing.</w:t>
-      </w:r>
-      <w:r>
-        <w:t xml:space="preserve"> </w:t>
-      </w:r>
-      <w:r>
-        <w:t xml:space="preserve">Three things.</w:t>
-      </w:r>
-    </w:p>
-    <w:p>
-      <w:pPr>
-        <w:pStyle w:val="BodyText"/>
-      </w:pPr>
-      <w:r>
-        <w:t xml:space="preserve">The conditioning scalar defaults to the Peclet number, not the Reynolds number. The published model uses Re because their campaign swept it; our datasets record Pe and do not record Re. The operator does not care which, so long as it is the same quantity at training and at prediction, and the checkpoint records the choice so the two cannot silently differ. A bare state_dict is refused for the same reason: nothing in it says how its inputs were scaled.</w:t>
-      </w:r>
-    </w:p>
-    <w:p>
-      <w:pPr>
-        <w:pStyle w:val="BodyText"/>
-      </w:pPr>
-      <w:r>
-        <w:t xml:space="preserve">Early stopping watches the DATA term alone, never the sum. Watching the sum would let a run that is getting worse at velocity look like it is improving because the divergence term fell, which is the opposite of what the model is for.</w:t>
-      </w:r>
-    </w:p>
-    <w:p>
-      <w:pPr>
-        <w:pStyle w:val="BodyText"/>
-      </w:pPr>
-      <w:r>
-        <w:t xml:space="preserve">The divergence weight is a real trade. Their own sweep found the velocity error essentially flat up to lambda 10 and clearly worse past 100, while the divergence error fell throughout. Ten is the default. Raise it only if you are going to integrate fluxes across an interface, and note their own evidence that downstream concentration accuracy is insensitive to lambda below 100, which says the benefit comes from the flow information rather than from enforcing incompressibility.</w:t>
-      </w:r>
-    </w:p>
-    <w:p>
-      <w:pPr>
-        <w:pStyle w:val="BodyText"/>
-      </w:pPr>
-      <w:r>
-        <w:t>(641, 512 and 385 lines.)</w:t>
-      </w:r>
-    </w:p>
-    <w:p>
-      <w:pPr>
-        <w:pStyle w:val="BodyText"/>
-      </w:pPr>
-      <w:r>
-        <w:t xml:space="preserve">test_flow_pipeline.py and test_reference_parity.py</w:t>
-      </w:r>
-    </w:p>
-    <w:p>
-      <w:pPr>
-        <w:pStyle w:val="BodyText"/>
-      </w:pPr>
-      <w:r>
-        <w:rPr>
-          <w:iCs/>
-          <w:i/>
-        </w:rPr>
-        <w:t xml:space="preserve">Does it run, and is it theirs?</w:t>
-      </w:r>
-    </w:p>
-    <w:p>
-      <w:pPr>
-        <w:pStyle w:val="BodyText"/>
-      </w:pPr>
-      <w:r>
-        <w:t xml:space="preserve">The pipeline test has four groups: the descriptors’ own self tests, the port against the released weights, the wiring end to end on a dataset it builds itself, and the guards. The wiring group proves the shapes line up and the scaling survives a round trip. It proves nothing about accuracy and says so.</w:t>
-      </w:r>
-    </w:p>
-    <w:p>
-      <w:pPr>
-        <w:pStyle w:val="BodyText"/>
-      </w:pPr>
-      <w:r>
-        <w:t xml:space="preserve">The parity test is the one that matters most. It runs the feature functions copied verbatim out of the released load notebook beside ours on their bundled domain, compares all three maps, then runs their trained weights twice, once fed by their features and once by ours, and compares the two predicted velocity fields. It currently reports every value identical, to the last bit. If it ever stops doing that, every later comparison with their published numbers is measuring our reimplementation rather than their method.</w:t>
-      </w:r>
-    </w:p>
-    <w:p>
-      <w:pPr>
-        <w:pStyle w:val="BodyText"/>
-      </w:pPr>
-      <w:r>
-        <w:rPr>
-          <w:bCs/>
-          <w:b/>
-        </w:rPr>
-        <w:t xml:space="preserve">Run them like this.</w:t>
-      </w:r>
-    </w:p>
-    <w:p>
-      <w:pPr>
-        <w:pStyle w:val="BodyText"/>
-      </w:pPr>
-      <w:r>
-        <w:t xml:space="preserve">python test_flow_pipeline.py</w:t>
-      </w:r>
-    </w:p>
-    <w:p>
-      <w:pPr>
-        <w:pStyle w:val="BodyText"/>
-      </w:pPr>
-      <w:r>
-        <w:t xml:space="preserve">python test_reference_parity.py --reference /path/to/velocity-informed</w:t>
-      </w:r>
-    </w:p>
-    <w:p>
-      <w:pPr>
-        <w:pStyle w:val="BodyText"/>
-      </w:pPr>
-      <w:r>
-        <w:rPr>
-          <w:bCs/>
-          <w:b/>
-        </w:rPr>
-        <w:t xml:space="preserve">What you get back.</w:t>
-      </w:r>
-      <w:r>
-        <w:t xml:space="preserve"> </w:t>
-      </w:r>
-      <w:r>
-        <w:t xml:space="preserve">Nothing that survives the run. The parity test is skipped, and says it is skipped, when the released repository is not on the machine, which is weaker than passing and is printed differently.</w:t>
-      </w:r>
-    </w:p>
-    <w:p>
-      <w:pPr>
-        <w:pStyle w:val="BodyText"/>
-      </w:pPr>
-      <w:r>
-        <w:t>(361 and 224 lines.)</w:t>
       </w:r>
     </w:p>
     <w:bookmarkEnd w:id="27"/>

</xml_diff>